<commit_message>
update table of contents
</commit_message>
<xml_diff>
--- a/docs/Documents/SYSARC 1.docx
+++ b/docs/Documents/SYSARC 1.docx
@@ -473,7 +473,7 @@
         </w:rPr>
         <w:fldChar w:fldCharType="separate"/>
       </w:r>
-      <w:hyperlink w:anchor="_Toc220427017" w:history="1">
+      <w:hyperlink w:anchor="_Toc220432130" w:history="1">
         <w:r>
           <w:rPr>
             <w:rStyle w:val="Hyperlink"/>
@@ -500,7 +500,7 @@
             <w:noProof/>
             <w:webHidden/>
           </w:rPr>
-          <w:instrText xml:space="preserve"> PAGEREF _Toc220427017 \h </w:instrText>
+          <w:instrText xml:space="preserve"> PAGEREF _Toc220432130 \h </w:instrText>
         </w:r>
         <w:r>
           <w:rPr>
@@ -541,7 +541,7 @@
           <w:lang w:val="en-US"/>
         </w:rPr>
       </w:pPr>
-      <w:hyperlink w:anchor="_Toc220427018" w:history="1">
+      <w:hyperlink w:anchor="_Toc220432131" w:history="1">
         <w:r>
           <w:rPr>
             <w:rStyle w:val="Hyperlink"/>
@@ -568,7 +568,7 @@
             <w:noProof/>
             <w:webHidden/>
           </w:rPr>
-          <w:instrText xml:space="preserve"> PAGEREF _Toc220427018 \h </w:instrText>
+          <w:instrText xml:space="preserve"> PAGEREF _Toc220432131 \h </w:instrText>
         </w:r>
         <w:r>
           <w:rPr>
@@ -609,7 +609,7 @@
           <w:lang w:val="en-US"/>
         </w:rPr>
       </w:pPr>
-      <w:hyperlink w:anchor="_Toc220427019" w:history="1">
+      <w:hyperlink w:anchor="_Toc220432132" w:history="1">
         <w:r>
           <w:rPr>
             <w:rStyle w:val="Hyperlink"/>
@@ -636,7 +636,7 @@
             <w:noProof/>
             <w:webHidden/>
           </w:rPr>
-          <w:instrText xml:space="preserve"> PAGEREF _Toc220427019 \h </w:instrText>
+          <w:instrText xml:space="preserve"> PAGEREF _Toc220432132 \h </w:instrText>
         </w:r>
         <w:r>
           <w:rPr>
@@ -677,7 +677,7 @@
           <w:lang w:val="en-US"/>
         </w:rPr>
       </w:pPr>
-      <w:hyperlink w:anchor="_Toc220427020" w:history="1">
+      <w:hyperlink w:anchor="_Toc220432133" w:history="1">
         <w:r>
           <w:rPr>
             <w:rStyle w:val="Hyperlink"/>
@@ -704,7 +704,7 @@
             <w:noProof/>
             <w:webHidden/>
           </w:rPr>
-          <w:instrText xml:space="preserve"> PAGEREF _Toc220427020 \h </w:instrText>
+          <w:instrText xml:space="preserve"> PAGEREF _Toc220432133 \h </w:instrText>
         </w:r>
         <w:r>
           <w:rPr>
@@ -745,7 +745,7 @@
           <w:lang w:val="en-US"/>
         </w:rPr>
       </w:pPr>
-      <w:hyperlink w:anchor="_Toc220427021" w:history="1">
+      <w:hyperlink w:anchor="_Toc220432134" w:history="1">
         <w:r>
           <w:rPr>
             <w:rStyle w:val="Hyperlink"/>
@@ -772,7 +772,7 @@
             <w:noProof/>
             <w:webHidden/>
           </w:rPr>
-          <w:instrText xml:space="preserve"> PAGEREF _Toc220427021 \h </w:instrText>
+          <w:instrText xml:space="preserve"> PAGEREF _Toc220432134 \h </w:instrText>
         </w:r>
         <w:r>
           <w:rPr>
@@ -813,7 +813,7 @@
           <w:lang w:val="en-US"/>
         </w:rPr>
       </w:pPr>
-      <w:hyperlink w:anchor="_Toc220427022" w:history="1">
+      <w:hyperlink w:anchor="_Toc220432135" w:history="1">
         <w:r>
           <w:rPr>
             <w:rStyle w:val="Hyperlink"/>
@@ -841,7 +841,7 @@
             <w:noProof/>
             <w:webHidden/>
           </w:rPr>
-          <w:instrText xml:space="preserve"> PAGEREF _Toc220427022 \h </w:instrText>
+          <w:instrText xml:space="preserve"> PAGEREF _Toc220432135 \h </w:instrText>
         </w:r>
         <w:r>
           <w:rPr>
@@ -882,7 +882,7 @@
           <w:lang w:val="en-US"/>
         </w:rPr>
       </w:pPr>
-      <w:hyperlink w:anchor="_Toc220427023" w:history="1">
+      <w:hyperlink w:anchor="_Toc220432136" w:history="1">
         <w:r>
           <w:rPr>
             <w:rStyle w:val="Hyperlink"/>
@@ -909,7 +909,7 @@
             <w:noProof/>
             <w:webHidden/>
           </w:rPr>
-          <w:instrText xml:space="preserve"> PAGEREF _Toc220427023 \h </w:instrText>
+          <w:instrText xml:space="preserve"> PAGEREF _Toc220432136 \h </w:instrText>
         </w:r>
         <w:r>
           <w:rPr>
@@ -950,7 +950,7 @@
           <w:lang w:val="en-US"/>
         </w:rPr>
       </w:pPr>
-      <w:hyperlink w:anchor="_Toc220427024" w:history="1">
+      <w:hyperlink w:anchor="_Toc220432137" w:history="1">
         <w:r>
           <w:rPr>
             <w:rStyle w:val="Hyperlink"/>
@@ -977,7 +977,7 @@
             <w:noProof/>
             <w:webHidden/>
           </w:rPr>
-          <w:instrText xml:space="preserve"> PAGEREF _Toc220427024 \h </w:instrText>
+          <w:instrText xml:space="preserve"> PAGEREF _Toc220432137 \h </w:instrText>
         </w:r>
         <w:r>
           <w:rPr>
@@ -1018,7 +1018,7 @@
           <w:lang w:val="en-US"/>
         </w:rPr>
       </w:pPr>
-      <w:hyperlink w:anchor="_Toc220427025" w:history="1">
+      <w:hyperlink w:anchor="_Toc220432138" w:history="1">
         <w:r>
           <w:rPr>
             <w:rStyle w:val="Hyperlink"/>
@@ -1045,7 +1045,7 @@
             <w:noProof/>
             <w:webHidden/>
           </w:rPr>
-          <w:instrText xml:space="preserve"> PAGEREF _Toc220427025 \h </w:instrText>
+          <w:instrText xml:space="preserve"> PAGEREF _Toc220432138 \h </w:instrText>
         </w:r>
         <w:r>
           <w:rPr>
@@ -1086,7 +1086,7 @@
           <w:lang w:val="en-US"/>
         </w:rPr>
       </w:pPr>
-      <w:hyperlink w:anchor="_Toc220427026" w:history="1">
+      <w:hyperlink w:anchor="_Toc220432139" w:history="1">
         <w:r>
           <w:rPr>
             <w:rStyle w:val="Hyperlink"/>
@@ -1113,7 +1113,7 @@
             <w:noProof/>
             <w:webHidden/>
           </w:rPr>
-          <w:instrText xml:space="preserve"> PAGEREF _Toc220427026 \h </w:instrText>
+          <w:instrText xml:space="preserve"> PAGEREF _Toc220432139 \h </w:instrText>
         </w:r>
         <w:r>
           <w:rPr>
@@ -1154,7 +1154,7 @@
           <w:lang w:val="en-US"/>
         </w:rPr>
       </w:pPr>
-      <w:hyperlink w:anchor="_Toc220427027" w:history="1">
+      <w:hyperlink w:anchor="_Toc220432140" w:history="1">
         <w:r>
           <w:rPr>
             <w:rStyle w:val="Hyperlink"/>
@@ -1181,7 +1181,7 @@
             <w:noProof/>
             <w:webHidden/>
           </w:rPr>
-          <w:instrText xml:space="preserve"> PAGEREF _Toc220427027 \h </w:instrText>
+          <w:instrText xml:space="preserve"> PAGEREF _Toc220432140 \h </w:instrText>
         </w:r>
         <w:r>
           <w:rPr>
@@ -1222,7 +1222,7 @@
           <w:lang w:val="en-US"/>
         </w:rPr>
       </w:pPr>
-      <w:hyperlink w:anchor="_Toc220427028" w:history="1">
+      <w:hyperlink w:anchor="_Toc220432141" w:history="1">
         <w:r>
           <w:rPr>
             <w:rStyle w:val="Hyperlink"/>
@@ -1249,7 +1249,7 @@
             <w:noProof/>
             <w:webHidden/>
           </w:rPr>
-          <w:instrText xml:space="preserve"> PAGEREF _Toc220427028 \h </w:instrText>
+          <w:instrText xml:space="preserve"> PAGEREF _Toc220432141 \h </w:instrText>
         </w:r>
         <w:r>
           <w:rPr>
@@ -1290,7 +1290,7 @@
           <w:lang w:val="en-US"/>
         </w:rPr>
       </w:pPr>
-      <w:hyperlink w:anchor="_Toc220427029" w:history="1">
+      <w:hyperlink w:anchor="_Toc220432142" w:history="1">
         <w:r>
           <w:rPr>
             <w:rStyle w:val="Hyperlink"/>
@@ -1317,7 +1317,7 @@
             <w:noProof/>
             <w:webHidden/>
           </w:rPr>
-          <w:instrText xml:space="preserve"> PAGEREF _Toc220427029 \h </w:instrText>
+          <w:instrText xml:space="preserve"> PAGEREF _Toc220432142 \h </w:instrText>
         </w:r>
         <w:r>
           <w:rPr>
@@ -1358,7 +1358,7 @@
           <w:lang w:val="en-US"/>
         </w:rPr>
       </w:pPr>
-      <w:hyperlink w:anchor="_Toc220427030" w:history="1">
+      <w:hyperlink w:anchor="_Toc220432143" w:history="1">
         <w:r>
           <w:rPr>
             <w:rStyle w:val="Hyperlink"/>
@@ -1385,7 +1385,7 @@
             <w:noProof/>
             <w:webHidden/>
           </w:rPr>
-          <w:instrText xml:space="preserve"> PAGEREF _Toc220427030 \h </w:instrText>
+          <w:instrText xml:space="preserve"> PAGEREF _Toc220432143 \h </w:instrText>
         </w:r>
         <w:r>
           <w:rPr>
@@ -1426,7 +1426,7 @@
           <w:lang w:val="en-US"/>
         </w:rPr>
       </w:pPr>
-      <w:hyperlink w:anchor="_Toc220427031" w:history="1">
+      <w:hyperlink w:anchor="_Toc220432144" w:history="1">
         <w:r>
           <w:rPr>
             <w:rStyle w:val="Hyperlink"/>
@@ -1453,7 +1453,7 @@
             <w:noProof/>
             <w:webHidden/>
           </w:rPr>
-          <w:instrText xml:space="preserve"> PAGEREF _Toc220427031 \h </w:instrText>
+          <w:instrText xml:space="preserve"> PAGEREF _Toc220432144 \h </w:instrText>
         </w:r>
         <w:r>
           <w:rPr>
@@ -1494,7 +1494,7 @@
           <w:lang w:val="en-US"/>
         </w:rPr>
       </w:pPr>
-      <w:hyperlink w:anchor="_Toc220427032" w:history="1">
+      <w:hyperlink w:anchor="_Toc220432145" w:history="1">
         <w:r>
           <w:rPr>
             <w:rStyle w:val="Hyperlink"/>
@@ -1521,7 +1521,7 @@
             <w:noProof/>
             <w:webHidden/>
           </w:rPr>
-          <w:instrText xml:space="preserve"> PAGEREF _Toc220427032 \h </w:instrText>
+          <w:instrText xml:space="preserve"> PAGEREF _Toc220432145 \h </w:instrText>
         </w:r>
         <w:r>
           <w:rPr>
@@ -1562,7 +1562,7 @@
           <w:lang w:val="en-US"/>
         </w:rPr>
       </w:pPr>
-      <w:hyperlink w:anchor="_Toc220427033" w:history="1">
+      <w:hyperlink w:anchor="_Toc220432146" w:history="1">
         <w:r>
           <w:rPr>
             <w:rStyle w:val="Hyperlink"/>
@@ -1590,7 +1590,7 @@
             <w:noProof/>
             <w:webHidden/>
           </w:rPr>
-          <w:instrText xml:space="preserve"> PAGEREF _Toc220427033 \h </w:instrText>
+          <w:instrText xml:space="preserve"> PAGEREF _Toc220432146 \h </w:instrText>
         </w:r>
         <w:r>
           <w:rPr>
@@ -1631,7 +1631,7 @@
           <w:lang w:val="en-US"/>
         </w:rPr>
       </w:pPr>
-      <w:hyperlink w:anchor="_Toc220427034" w:history="1">
+      <w:hyperlink w:anchor="_Toc220432147" w:history="1">
         <w:r>
           <w:rPr>
             <w:rStyle w:val="Hyperlink"/>
@@ -1658,7 +1658,7 @@
             <w:noProof/>
             <w:webHidden/>
           </w:rPr>
-          <w:instrText xml:space="preserve"> PAGEREF _Toc220427034 \h </w:instrText>
+          <w:instrText xml:space="preserve"> PAGEREF _Toc220432147 \h </w:instrText>
         </w:r>
         <w:r>
           <w:rPr>
@@ -1699,7 +1699,7 @@
           <w:lang w:val="en-US"/>
         </w:rPr>
       </w:pPr>
-      <w:hyperlink w:anchor="_Toc220427035" w:history="1">
+      <w:hyperlink w:anchor="_Toc220432148" w:history="1">
         <w:r>
           <w:rPr>
             <w:rStyle w:val="Hyperlink"/>
@@ -1726,7 +1726,7 @@
             <w:noProof/>
             <w:webHidden/>
           </w:rPr>
-          <w:instrText xml:space="preserve"> PAGEREF _Toc220427035 \h </w:instrText>
+          <w:instrText xml:space="preserve"> PAGEREF _Toc220432148 \h </w:instrText>
         </w:r>
         <w:r>
           <w:rPr>
@@ -1767,7 +1767,7 @@
           <w:lang w:val="en-US"/>
         </w:rPr>
       </w:pPr>
-      <w:hyperlink w:anchor="_Toc220427036" w:history="1">
+      <w:hyperlink w:anchor="_Toc220432149" w:history="1">
         <w:r>
           <w:rPr>
             <w:rStyle w:val="Hyperlink"/>
@@ -1794,7 +1794,7 @@
             <w:noProof/>
             <w:webHidden/>
           </w:rPr>
-          <w:instrText xml:space="preserve"> PAGEREF _Toc220427036 \h </w:instrText>
+          <w:instrText xml:space="preserve"> PAGEREF _Toc220432149 \h </w:instrText>
         </w:r>
         <w:r>
           <w:rPr>
@@ -1814,7 +1814,7 @@
             <w:noProof/>
             <w:webHidden/>
           </w:rPr>
-          <w:t>17</w:t>
+          <w:t>18</w:t>
         </w:r>
         <w:r>
           <w:rPr>
@@ -1835,7 +1835,7 @@
           <w:lang w:val="en-US"/>
         </w:rPr>
       </w:pPr>
-      <w:hyperlink w:anchor="_Toc220427037" w:history="1">
+      <w:hyperlink w:anchor="_Toc220432150" w:history="1">
         <w:r>
           <w:rPr>
             <w:rStyle w:val="Hyperlink"/>
@@ -1862,7 +1862,7 @@
             <w:noProof/>
             <w:webHidden/>
           </w:rPr>
-          <w:instrText xml:space="preserve"> PAGEREF _Toc220427037 \h </w:instrText>
+          <w:instrText xml:space="preserve"> PAGEREF _Toc220432150 \h </w:instrText>
         </w:r>
         <w:r>
           <w:rPr>
@@ -1882,7 +1882,7 @@
             <w:noProof/>
             <w:webHidden/>
           </w:rPr>
-          <w:t>17</w:t>
+          <w:t>18</w:t>
         </w:r>
         <w:r>
           <w:rPr>
@@ -1903,7 +1903,7 @@
           <w:lang w:val="en-US"/>
         </w:rPr>
       </w:pPr>
-      <w:hyperlink w:anchor="_Toc220427038" w:history="1">
+      <w:hyperlink w:anchor="_Toc220432151" w:history="1">
         <w:r>
           <w:rPr>
             <w:rStyle w:val="Hyperlink"/>
@@ -1930,7 +1930,7 @@
             <w:noProof/>
             <w:webHidden/>
           </w:rPr>
-          <w:instrText xml:space="preserve"> PAGEREF _Toc220427038 \h </w:instrText>
+          <w:instrText xml:space="preserve"> PAGEREF _Toc220432151 \h </w:instrText>
         </w:r>
         <w:r>
           <w:rPr>
@@ -1950,7 +1950,7 @@
             <w:noProof/>
             <w:webHidden/>
           </w:rPr>
-          <w:t>18</w:t>
+          <w:t>19</w:t>
         </w:r>
         <w:r>
           <w:rPr>
@@ -1971,7 +1971,7 @@
           <w:lang w:val="en-US"/>
         </w:rPr>
       </w:pPr>
-      <w:hyperlink w:anchor="_Toc220427039" w:history="1">
+      <w:hyperlink w:anchor="_Toc220432152" w:history="1">
         <w:r>
           <w:rPr>
             <w:rStyle w:val="Hyperlink"/>
@@ -1998,7 +1998,7 @@
             <w:noProof/>
             <w:webHidden/>
           </w:rPr>
-          <w:instrText xml:space="preserve"> PAGEREF _Toc220427039 \h </w:instrText>
+          <w:instrText xml:space="preserve"> PAGEREF _Toc220432152 \h </w:instrText>
         </w:r>
         <w:r>
           <w:rPr>
@@ -2018,7 +2018,7 @@
             <w:noProof/>
             <w:webHidden/>
           </w:rPr>
-          <w:t>18</w:t>
+          <w:t>19</w:t>
         </w:r>
         <w:r>
           <w:rPr>
@@ -2039,7 +2039,7 @@
           <w:lang w:val="en-US"/>
         </w:rPr>
       </w:pPr>
-      <w:hyperlink w:anchor="_Toc220427040" w:history="1">
+      <w:hyperlink w:anchor="_Toc220432153" w:history="1">
         <w:r>
           <w:rPr>
             <w:rStyle w:val="Hyperlink"/>
@@ -2066,7 +2066,7 @@
             <w:noProof/>
             <w:webHidden/>
           </w:rPr>
-          <w:instrText xml:space="preserve"> PAGEREF _Toc220427040 \h </w:instrText>
+          <w:instrText xml:space="preserve"> PAGEREF _Toc220432153 \h </w:instrText>
         </w:r>
         <w:r>
           <w:rPr>
@@ -2086,7 +2086,7 @@
             <w:noProof/>
             <w:webHidden/>
           </w:rPr>
-          <w:t>18</w:t>
+          <w:t>19</w:t>
         </w:r>
         <w:r>
           <w:rPr>
@@ -2107,7 +2107,7 @@
           <w:lang w:val="en-US"/>
         </w:rPr>
       </w:pPr>
-      <w:hyperlink w:anchor="_Toc220427041" w:history="1">
+      <w:hyperlink w:anchor="_Toc220432154" w:history="1">
         <w:r>
           <w:rPr>
             <w:rStyle w:val="Hyperlink"/>
@@ -2134,7 +2134,7 @@
             <w:noProof/>
             <w:webHidden/>
           </w:rPr>
-          <w:instrText xml:space="preserve"> PAGEREF _Toc220427041 \h </w:instrText>
+          <w:instrText xml:space="preserve"> PAGEREF _Toc220432154 \h </w:instrText>
         </w:r>
         <w:r>
           <w:rPr>
@@ -2154,7 +2154,7 @@
             <w:noProof/>
             <w:webHidden/>
           </w:rPr>
-          <w:t>18</w:t>
+          <w:t>19</w:t>
         </w:r>
         <w:r>
           <w:rPr>
@@ -2175,7 +2175,7 @@
           <w:lang w:val="en-US"/>
         </w:rPr>
       </w:pPr>
-      <w:hyperlink w:anchor="_Toc220427042" w:history="1">
+      <w:hyperlink w:anchor="_Toc220432155" w:history="1">
         <w:r>
           <w:rPr>
             <w:rStyle w:val="Hyperlink"/>
@@ -2202,7 +2202,7 @@
             <w:noProof/>
             <w:webHidden/>
           </w:rPr>
-          <w:instrText xml:space="preserve"> PAGEREF _Toc220427042 \h </w:instrText>
+          <w:instrText xml:space="preserve"> PAGEREF _Toc220432155 \h </w:instrText>
         </w:r>
         <w:r>
           <w:rPr>
@@ -2222,7 +2222,7 @@
             <w:noProof/>
             <w:webHidden/>
           </w:rPr>
-          <w:t>19</w:t>
+          <w:t>20</w:t>
         </w:r>
         <w:r>
           <w:rPr>
@@ -2243,7 +2243,7 @@
           <w:lang w:val="en-US"/>
         </w:rPr>
       </w:pPr>
-      <w:hyperlink w:anchor="_Toc220427043" w:history="1">
+      <w:hyperlink w:anchor="_Toc220432156" w:history="1">
         <w:r>
           <w:rPr>
             <w:rStyle w:val="Hyperlink"/>
@@ -2270,7 +2270,7 @@
             <w:noProof/>
             <w:webHidden/>
           </w:rPr>
-          <w:instrText xml:space="preserve"> PAGEREF _Toc220427043 \h </w:instrText>
+          <w:instrText xml:space="preserve"> PAGEREF _Toc220432156 \h </w:instrText>
         </w:r>
         <w:r>
           <w:rPr>
@@ -2290,7 +2290,7 @@
             <w:noProof/>
             <w:webHidden/>
           </w:rPr>
-          <w:t>20</w:t>
+          <w:t>21</w:t>
         </w:r>
         <w:r>
           <w:rPr>
@@ -2311,13 +2311,13 @@
           <w:lang w:val="en-US"/>
         </w:rPr>
       </w:pPr>
-      <w:hyperlink w:anchor="_Toc220427044" w:history="1">
+      <w:hyperlink w:anchor="_Toc220432157" w:history="1">
         <w:r>
           <w:rPr>
             <w:rStyle w:val="Hyperlink"/>
             <w:noProof/>
           </w:rPr>
-          <w:t>Group Picture</w:t>
+          <w:t>Data Dictionary</w:t>
         </w:r>
         <w:r>
           <w:rPr>
@@ -2338,7 +2338,7 @@
             <w:noProof/>
             <w:webHidden/>
           </w:rPr>
-          <w:instrText xml:space="preserve"> PAGEREF _Toc220427044 \h </w:instrText>
+          <w:instrText xml:space="preserve"> PAGEREF _Toc220432157 \h </w:instrText>
         </w:r>
         <w:r>
           <w:rPr>
@@ -2358,7 +2358,7 @@
             <w:noProof/>
             <w:webHidden/>
           </w:rPr>
-          <w:t>21</w:t>
+          <w:t>22</w:t>
         </w:r>
         <w:r>
           <w:rPr>
@@ -2379,12 +2379,80 @@
           <w:lang w:val="en-US"/>
         </w:rPr>
       </w:pPr>
-      <w:hyperlink w:anchor="_Toc220427045" w:history="1">
+      <w:hyperlink w:anchor="_Toc220432158" w:history="1">
         <w:r>
           <w:rPr>
             <w:rStyle w:val="Hyperlink"/>
             <w:noProof/>
           </w:rPr>
+          <w:t>Group Picture</w:t>
+        </w:r>
+        <w:r>
+          <w:rPr>
+            <w:noProof/>
+            <w:webHidden/>
+          </w:rPr>
+          <w:tab/>
+        </w:r>
+        <w:r>
+          <w:rPr>
+            <w:noProof/>
+            <w:webHidden/>
+          </w:rPr>
+          <w:fldChar w:fldCharType="begin"/>
+        </w:r>
+        <w:r>
+          <w:rPr>
+            <w:noProof/>
+            <w:webHidden/>
+          </w:rPr>
+          <w:instrText xml:space="preserve"> PAGEREF _Toc220432158 \h </w:instrText>
+        </w:r>
+        <w:r>
+          <w:rPr>
+            <w:noProof/>
+            <w:webHidden/>
+          </w:rPr>
+        </w:r>
+        <w:r>
+          <w:rPr>
+            <w:noProof/>
+            <w:webHidden/>
+          </w:rPr>
+          <w:fldChar w:fldCharType="separate"/>
+        </w:r>
+        <w:r>
+          <w:rPr>
+            <w:noProof/>
+            <w:webHidden/>
+          </w:rPr>
+          <w:t>23</w:t>
+        </w:r>
+        <w:r>
+          <w:rPr>
+            <w:noProof/>
+            <w:webHidden/>
+          </w:rPr>
+          <w:fldChar w:fldCharType="end"/>
+        </w:r>
+      </w:hyperlink>
+    </w:p>
+    <w:p>
+      <w:pPr>
+        <w:pStyle w:val="TOC1"/>
+        <w:rPr>
+          <w:rFonts w:asciiTheme="minorHAnsi" w:eastAsiaTheme="minorEastAsia" w:hAnsiTheme="minorHAnsi"/>
+          <w:noProof/>
+          <w:sz w:val="22"/>
+          <w:lang w:val="en-US"/>
+        </w:rPr>
+      </w:pPr>
+      <w:hyperlink w:anchor="_Toc220432159" w:history="1">
+        <w:r>
+          <w:rPr>
+            <w:rStyle w:val="Hyperlink"/>
+            <w:noProof/>
+          </w:rPr>
           <w:t>Resume</w:t>
         </w:r>
         <w:r>
@@ -2406,7 +2474,7 @@
             <w:noProof/>
             <w:webHidden/>
           </w:rPr>
-          <w:instrText xml:space="preserve"> PAGEREF _Toc220427045 \h </w:instrText>
+          <w:instrText xml:space="preserve"> PAGEREF _Toc220432159 \h </w:instrText>
         </w:r>
         <w:r>
           <w:rPr>
@@ -2426,7 +2494,7 @@
             <w:noProof/>
             <w:webHidden/>
           </w:rPr>
-          <w:t>22</w:t>
+          <w:t>24</w:t>
         </w:r>
         <w:r>
           <w:rPr>
@@ -2479,7 +2547,7 @@
       <w:bookmarkStart w:id="9" w:name="_Toc198253028"/>
       <w:bookmarkStart w:id="10" w:name="_Toc198255354"/>
       <w:bookmarkStart w:id="11" w:name="_Toc198518408"/>
-      <w:bookmarkStart w:id="12" w:name="_Toc220427017"/>
+      <w:bookmarkStart w:id="12" w:name="_Toc220432130"/>
       <w:r>
         <w:lastRenderedPageBreak/>
         <w:t>Acknowledgements</w:t>
@@ -2530,7 +2598,7 @@
       <w:pPr>
         <w:pStyle w:val="Heading1"/>
       </w:pPr>
-      <w:bookmarkStart w:id="18" w:name="_Toc220427018"/>
+      <w:bookmarkStart w:id="18" w:name="_Toc220432131"/>
       <w:r>
         <w:t>Dedication</w:t>
       </w:r>
@@ -2551,7 +2619,7 @@
       <w:r>
         <w:br w:type="page"/>
       </w:r>
-      <w:bookmarkStart w:id="19" w:name="_Toc220427019"/>
+      <w:bookmarkStart w:id="19" w:name="_Toc220432132"/>
       <w:r>
         <w:lastRenderedPageBreak/>
         <w:t>Scopes and Objectives</w:t>
@@ -2562,7 +2630,7 @@
       <w:pPr>
         <w:pStyle w:val="Heading2"/>
       </w:pPr>
-      <w:bookmarkStart w:id="20" w:name="_Toc220427020"/>
+      <w:bookmarkStart w:id="20" w:name="_Toc220432133"/>
       <w:r>
         <w:t xml:space="preserve">Project </w:t>
       </w:r>
@@ -2637,7 +2705,7 @@
           <w:lang w:val="en-US"/>
         </w:rPr>
       </w:pPr>
-      <w:bookmarkStart w:id="21" w:name="_Toc220427021"/>
+      <w:bookmarkStart w:id="21" w:name="_Toc220432134"/>
       <w:r>
         <w:t>Project Scopes</w:t>
       </w:r>
@@ -2685,7 +2753,7 @@
           <w:lang w:val="en-US"/>
         </w:rPr>
       </w:pPr>
-      <w:bookmarkStart w:id="22" w:name="_Toc220427022"/>
+      <w:bookmarkStart w:id="22" w:name="_Toc220432135"/>
       <w:r>
         <w:rPr>
           <w:lang w:val="en-US"/>
@@ -3065,7 +3133,7 @@
       <w:pPr>
         <w:pStyle w:val="Heading2"/>
       </w:pPr>
-      <w:bookmarkStart w:id="23" w:name="_Toc220427023"/>
+      <w:bookmarkStart w:id="23" w:name="_Toc220432136"/>
       <w:r>
         <w:lastRenderedPageBreak/>
         <w:t>Project Objectives</w:t>
@@ -3124,7 +3192,7 @@
       <w:pPr>
         <w:pStyle w:val="Heading2"/>
       </w:pPr>
-      <w:bookmarkStart w:id="24" w:name="_Toc220427024"/>
+      <w:bookmarkStart w:id="24" w:name="_Toc220432137"/>
       <w:r>
         <w:lastRenderedPageBreak/>
         <w:t>Project Constraints</w:t>
@@ -3456,7 +3524,7 @@
           <w:szCs w:val="24"/>
         </w:rPr>
       </w:pPr>
-      <w:bookmarkStart w:id="28" w:name="_Toc220427025"/>
+      <w:bookmarkStart w:id="28" w:name="_Toc220432138"/>
       <w:r>
         <w:lastRenderedPageBreak/>
         <w:t>Company Profile</w:t>
@@ -3549,7 +3617,7 @@
       <w:pPr>
         <w:pStyle w:val="Heading2"/>
       </w:pPr>
-      <w:bookmarkStart w:id="29" w:name="_Toc220427026"/>
+      <w:bookmarkStart w:id="29" w:name="_Toc220432139"/>
       <w:r>
         <w:t>Functional Decomposition Diagram (FDD)</w:t>
       </w:r>
@@ -3604,7 +3672,7 @@
       <w:pPr>
         <w:pStyle w:val="Heading1"/>
       </w:pPr>
-      <w:bookmarkStart w:id="30" w:name="_Toc220427027"/>
+      <w:bookmarkStart w:id="30" w:name="_Toc220432140"/>
       <w:r>
         <w:t>Existing System</w:t>
       </w:r>
@@ -3630,7 +3698,7 @@
       <w:pPr>
         <w:pStyle w:val="Heading2"/>
       </w:pPr>
-      <w:bookmarkStart w:id="31" w:name="_Toc220427028"/>
+      <w:bookmarkStart w:id="31" w:name="_Toc220432141"/>
       <w:r>
         <w:lastRenderedPageBreak/>
         <w:t xml:space="preserve">Existing System </w:t>
@@ -3706,7 +3774,7 @@
           <w:szCs w:val="24"/>
         </w:rPr>
       </w:pPr>
-      <w:bookmarkStart w:id="32" w:name="_Toc220427029"/>
+      <w:bookmarkStart w:id="32" w:name="_Toc220432142"/>
       <w:r>
         <w:lastRenderedPageBreak/>
         <w:t>Statement of the Problem</w:t>
@@ -3773,7 +3841,7 @@
       <w:pPr>
         <w:pStyle w:val="Heading2"/>
       </w:pPr>
-      <w:bookmarkStart w:id="33" w:name="_Toc220427030"/>
+      <w:bookmarkStart w:id="33" w:name="_Toc220432143"/>
       <w:r>
         <w:lastRenderedPageBreak/>
         <w:t>Solution</w:t>
@@ -3911,7 +3979,7 @@
       <w:pPr>
         <w:pStyle w:val="Heading1"/>
       </w:pPr>
-      <w:bookmarkStart w:id="34" w:name="_Toc220427031"/>
+      <w:bookmarkStart w:id="34" w:name="_Toc220432144"/>
       <w:r>
         <w:lastRenderedPageBreak/>
         <w:t>Proposed System</w:t>
@@ -3935,7 +4003,7 @@
       <w:pPr>
         <w:pStyle w:val="Heading2"/>
       </w:pPr>
-      <w:bookmarkStart w:id="35" w:name="_Toc220427032"/>
+      <w:bookmarkStart w:id="35" w:name="_Toc220432145"/>
       <w:r>
         <w:t>Characteristics</w:t>
       </w:r>
@@ -4014,7 +4082,7 @@
           <w:lang w:val="en-US"/>
         </w:rPr>
       </w:pPr>
-      <w:bookmarkStart w:id="36" w:name="_Toc220427033"/>
+      <w:bookmarkStart w:id="36" w:name="_Toc220432146"/>
       <w:r>
         <w:rPr>
           <w:lang w:val="en-US"/>
@@ -4443,7 +4511,7 @@
       <w:bookmarkStart w:id="44" w:name="_Toc197384329"/>
       <w:bookmarkStart w:id="45" w:name="_Toc197490302"/>
       <w:bookmarkStart w:id="46" w:name="_Toc197481803"/>
-      <w:bookmarkStart w:id="47" w:name="_Toc220427034"/>
+      <w:bookmarkStart w:id="47" w:name="_Toc220432147"/>
       <w:r>
         <w:lastRenderedPageBreak/>
         <w:t>Functional Decomposition Diagram</w:t>
@@ -4683,7 +4751,7 @@
       <w:pPr>
         <w:pStyle w:val="Heading2"/>
       </w:pPr>
-      <w:bookmarkStart w:id="48" w:name="_Toc220427035"/>
+      <w:bookmarkStart w:id="48" w:name="_Toc220432148"/>
       <w:r>
         <w:lastRenderedPageBreak/>
         <w:t>System Flowchart</w:t>
@@ -4692,9 +4760,14 @@
     </w:p>
     <w:p>
       <w:pPr>
-        <w:pStyle w:val="Heading2"/>
-      </w:pPr>
-      <w:r>
+        <w:pStyle w:val="NewNormal"/>
+        <w:jc w:val="center"/>
+      </w:pPr>
+      <w:bookmarkStart w:id="49" w:name="_GoBack"/>
+      <w:r>
+        <w:rPr>
+          <w:noProof/>
+        </w:rPr>
         <w:drawing>
           <wp:inline distT="0" distB="0" distL="0" distR="0" wp14:anchorId="2644E797" wp14:editId="4A245329">
             <wp:extent cx="5733651" cy="8470231"/>
@@ -4731,6 +4804,7 @@
           </wp:inline>
         </w:drawing>
       </w:r>
+      <w:bookmarkEnd w:id="49"/>
     </w:p>
     <w:p>
       <w:pPr>
@@ -4752,6 +4826,9 @@
         <w:jc w:val="center"/>
       </w:pPr>
       <w:r>
+        <w:rPr>
+          <w:noProof/>
+        </w:rPr>
         <w:lastRenderedPageBreak/>
         <w:drawing>
           <wp:inline distT="0" distB="0" distL="0" distR="0" wp14:anchorId="615D79AF" wp14:editId="131EA214">
@@ -4898,12 +4975,12 @@
       <w:pPr>
         <w:pStyle w:val="Heading2"/>
       </w:pPr>
-      <w:bookmarkStart w:id="49" w:name="_Toc220427036"/>
+      <w:bookmarkStart w:id="50" w:name="_Toc220432149"/>
       <w:r>
         <w:lastRenderedPageBreak/>
         <w:t>Data Flow Diagram</w:t>
       </w:r>
-      <w:bookmarkEnd w:id="49"/>
+      <w:bookmarkEnd w:id="50"/>
     </w:p>
     <w:p>
       <w:pPr>
@@ -4969,7 +5046,7 @@
       <w:pPr>
         <w:pStyle w:val="Heading2"/>
       </w:pPr>
-      <w:bookmarkStart w:id="50" w:name="_Toc220427037"/>
+      <w:bookmarkStart w:id="51" w:name="_Toc220432150"/>
       <w:r>
         <w:rPr>
           <w:noProof/>
@@ -5043,7 +5120,7 @@
       <w:r>
         <w:t>Detailed Data Flow Diagram</w:t>
       </w:r>
-      <w:bookmarkEnd w:id="50"/>
+      <w:bookmarkEnd w:id="51"/>
     </w:p>
     <w:p>
       <w:pPr>
@@ -5057,12 +5134,12 @@
       <w:pPr>
         <w:pStyle w:val="Heading1"/>
       </w:pPr>
-      <w:bookmarkStart w:id="51" w:name="_Toc220427038"/>
+      <w:bookmarkStart w:id="52" w:name="_Toc220432151"/>
       <w:r>
         <w:lastRenderedPageBreak/>
         <w:t>Cost and Benefit Analysis</w:t>
       </w:r>
-      <w:bookmarkEnd w:id="51"/>
+      <w:bookmarkEnd w:id="52"/>
     </w:p>
     <w:p>
       <w:pPr>
@@ -5079,24 +5156,24 @@
       <w:pPr>
         <w:pStyle w:val="Heading2"/>
       </w:pPr>
-      <w:bookmarkStart w:id="52" w:name="_Toc220427039"/>
+      <w:bookmarkStart w:id="53" w:name="_Toc220432152"/>
       <w:r>
         <w:t>DEVELOPMENT COS</w:t>
       </w:r>
-      <w:bookmarkStart w:id="53" w:name="_Toc197490308"/>
-      <w:bookmarkStart w:id="54" w:name="_Toc198518701"/>
-      <w:bookmarkStart w:id="55" w:name="_Toc198255373"/>
-      <w:bookmarkStart w:id="56" w:name="_Toc197455853"/>
-      <w:bookmarkStart w:id="57" w:name="_Toc197484733"/>
-      <w:bookmarkStart w:id="58" w:name="_Toc197384985"/>
-      <w:bookmarkStart w:id="59" w:name="_Toc198253047"/>
-      <w:bookmarkStart w:id="60" w:name="_Toc198518427"/>
-      <w:bookmarkStart w:id="61" w:name="_Toc197384334"/>
-      <w:bookmarkStart w:id="62" w:name="_Toc197481808"/>
+      <w:bookmarkStart w:id="54" w:name="_Toc197490308"/>
+      <w:bookmarkStart w:id="55" w:name="_Toc198518701"/>
+      <w:bookmarkStart w:id="56" w:name="_Toc198255373"/>
+      <w:bookmarkStart w:id="57" w:name="_Toc197455853"/>
+      <w:bookmarkStart w:id="58" w:name="_Toc197484733"/>
+      <w:bookmarkStart w:id="59" w:name="_Toc197384985"/>
+      <w:bookmarkStart w:id="60" w:name="_Toc198253047"/>
+      <w:bookmarkStart w:id="61" w:name="_Toc198518427"/>
+      <w:bookmarkStart w:id="62" w:name="_Toc197384334"/>
+      <w:bookmarkStart w:id="63" w:name="_Toc197481808"/>
       <w:r>
         <w:t>T</w:t>
       </w:r>
-      <w:bookmarkEnd w:id="52"/>
+      <w:bookmarkEnd w:id="53"/>
     </w:p>
     <w:tbl>
       <w:tblPr>
@@ -5344,21 +5421,20 @@
       <w:pPr>
         <w:pStyle w:val="Heading2"/>
       </w:pPr>
-      <w:bookmarkStart w:id="63" w:name="_Toc220427040"/>
+      <w:bookmarkStart w:id="64" w:name="_Toc220432153"/>
       <w:r>
         <w:t>HARDWARE COST</w:t>
       </w:r>
-      <w:bookmarkStart w:id="64" w:name="_Toc197455854"/>
-      <w:bookmarkStart w:id="65" w:name="_Toc198518702"/>
-      <w:bookmarkStart w:id="66" w:name="_Toc198255374"/>
-      <w:bookmarkStart w:id="67" w:name="_Toc198253048"/>
-      <w:bookmarkStart w:id="68" w:name="_Toc197384986"/>
-      <w:bookmarkStart w:id="69" w:name="_Toc197481809"/>
-      <w:bookmarkStart w:id="70" w:name="_Toc197384335"/>
-      <w:bookmarkStart w:id="71" w:name="_Toc197484734"/>
-      <w:bookmarkStart w:id="72" w:name="_Toc198518428"/>
-      <w:bookmarkStart w:id="73" w:name="_Toc197490309"/>
-      <w:bookmarkEnd w:id="53"/>
+      <w:bookmarkStart w:id="65" w:name="_Toc197455854"/>
+      <w:bookmarkStart w:id="66" w:name="_Toc198518702"/>
+      <w:bookmarkStart w:id="67" w:name="_Toc198255374"/>
+      <w:bookmarkStart w:id="68" w:name="_Toc198253048"/>
+      <w:bookmarkStart w:id="69" w:name="_Toc197384986"/>
+      <w:bookmarkStart w:id="70" w:name="_Toc197481809"/>
+      <w:bookmarkStart w:id="71" w:name="_Toc197384335"/>
+      <w:bookmarkStart w:id="72" w:name="_Toc197484734"/>
+      <w:bookmarkStart w:id="73" w:name="_Toc198518428"/>
+      <w:bookmarkStart w:id="74" w:name="_Toc197490309"/>
       <w:bookmarkEnd w:id="54"/>
       <w:bookmarkEnd w:id="55"/>
       <w:bookmarkEnd w:id="56"/>
@@ -5369,6 +5445,7 @@
       <w:bookmarkEnd w:id="61"/>
       <w:bookmarkEnd w:id="62"/>
       <w:bookmarkEnd w:id="63"/>
+      <w:bookmarkEnd w:id="64"/>
     </w:p>
     <w:tbl>
       <w:tblPr>
@@ -5635,11 +5712,10 @@
       <w:pPr>
         <w:pStyle w:val="Heading2"/>
       </w:pPr>
-      <w:bookmarkStart w:id="74" w:name="_Toc220427041"/>
+      <w:bookmarkStart w:id="75" w:name="_Toc220432154"/>
       <w:r>
         <w:t>OTHER MISCELLANEOUS COST</w:t>
       </w:r>
-      <w:bookmarkEnd w:id="64"/>
       <w:bookmarkEnd w:id="65"/>
       <w:bookmarkEnd w:id="66"/>
       <w:bookmarkEnd w:id="67"/>
@@ -5650,6 +5726,7 @@
       <w:bookmarkEnd w:id="72"/>
       <w:bookmarkEnd w:id="73"/>
       <w:bookmarkEnd w:id="74"/>
+      <w:bookmarkEnd w:id="75"/>
     </w:p>
     <w:tbl>
       <w:tblPr>
@@ -5941,22 +6018,21 @@
       <w:pPr>
         <w:pStyle w:val="Heading2"/>
       </w:pPr>
-      <w:bookmarkStart w:id="75" w:name="_Toc198518703"/>
-      <w:bookmarkStart w:id="76" w:name="_Toc198255375"/>
-      <w:bookmarkStart w:id="77" w:name="_Toc198253049"/>
-      <w:bookmarkStart w:id="78" w:name="_Toc197490310"/>
-      <w:bookmarkStart w:id="79" w:name="_Toc198518429"/>
-      <w:bookmarkStart w:id="80" w:name="_Toc197484735"/>
-      <w:bookmarkStart w:id="81" w:name="_Toc197481810"/>
-      <w:bookmarkStart w:id="82" w:name="_Toc197384336"/>
-      <w:bookmarkStart w:id="83" w:name="_Toc197455855"/>
-      <w:bookmarkStart w:id="84" w:name="_Toc197384987"/>
-      <w:bookmarkStart w:id="85" w:name="_Toc220427042"/>
+      <w:bookmarkStart w:id="76" w:name="_Toc198518703"/>
+      <w:bookmarkStart w:id="77" w:name="_Toc198255375"/>
+      <w:bookmarkStart w:id="78" w:name="_Toc198253049"/>
+      <w:bookmarkStart w:id="79" w:name="_Toc197490310"/>
+      <w:bookmarkStart w:id="80" w:name="_Toc198518429"/>
+      <w:bookmarkStart w:id="81" w:name="_Toc197484735"/>
+      <w:bookmarkStart w:id="82" w:name="_Toc197481810"/>
+      <w:bookmarkStart w:id="83" w:name="_Toc197384336"/>
+      <w:bookmarkStart w:id="84" w:name="_Toc197455855"/>
+      <w:bookmarkStart w:id="85" w:name="_Toc197384987"/>
+      <w:bookmarkStart w:id="86" w:name="_Toc220432155"/>
       <w:r>
         <w:lastRenderedPageBreak/>
         <w:t>TOTAL ESTIMATED DEVELOPMENT COST</w:t>
       </w:r>
-      <w:bookmarkEnd w:id="75"/>
       <w:bookmarkEnd w:id="76"/>
       <w:bookmarkEnd w:id="77"/>
       <w:bookmarkEnd w:id="78"/>
@@ -5967,6 +6043,7 @@
       <w:bookmarkEnd w:id="83"/>
       <w:bookmarkEnd w:id="84"/>
       <w:bookmarkEnd w:id="85"/>
+      <w:bookmarkEnd w:id="86"/>
     </w:p>
     <w:tbl>
       <w:tblPr>
@@ -6352,12 +6429,12 @@
       <w:pPr>
         <w:pStyle w:val="Heading1"/>
       </w:pPr>
-      <w:bookmarkStart w:id="86" w:name="_Toc220427043"/>
+      <w:bookmarkStart w:id="87" w:name="_Toc220432156"/>
       <w:r>
         <w:lastRenderedPageBreak/>
         <w:t>Appendix</w:t>
       </w:r>
-      <w:bookmarkEnd w:id="86"/>
+      <w:bookmarkEnd w:id="87"/>
     </w:p>
     <w:p>
       <w:pPr>
@@ -6589,10 +6666,12 @@
       <w:pPr>
         <w:pStyle w:val="Heading1"/>
       </w:pPr>
+      <w:bookmarkStart w:id="88" w:name="_Toc220432157"/>
       <w:r>
         <w:lastRenderedPageBreak/>
         <w:t>Data Dictionary</w:t>
       </w:r>
+      <w:bookmarkEnd w:id="88"/>
     </w:p>
     <w:tbl>
       <w:tblPr>
@@ -10158,8 +10237,6 @@
             </w:r>
           </w:p>
         </w:tc>
-        <w:bookmarkStart w:id="87" w:name="_GoBack"/>
-        <w:bookmarkEnd w:id="87"/>
       </w:tr>
       <w:tr>
         <w:trPr>
@@ -10952,7 +11029,7 @@
         <w:br w:type="page"/>
       </w:r>
     </w:p>
-    <w:bookmarkStart w:id="88" w:name="_Toc220427044"/>
+    <w:bookmarkStart w:id="89" w:name="_Toc220432158"/>
     <w:p>
       <w:pPr>
         <w:pStyle w:val="Heading1"/>
@@ -11031,7 +11108,7 @@
       <w:bookmarkEnd w:id="25"/>
       <w:bookmarkEnd w:id="26"/>
       <w:bookmarkEnd w:id="27"/>
-      <w:bookmarkEnd w:id="88"/>
+      <w:bookmarkEnd w:id="89"/>
     </w:p>
     <w:p>
       <w:pPr>
@@ -11112,18 +11189,18 @@
       <w:pPr>
         <w:pStyle w:val="Heading1"/>
       </w:pPr>
-      <w:bookmarkStart w:id="89" w:name="_Toc198253054"/>
-      <w:bookmarkStart w:id="90" w:name="_Toc198255380"/>
-      <w:bookmarkStart w:id="91" w:name="_Toc198518434"/>
-      <w:bookmarkStart w:id="92" w:name="_Toc220427045"/>
+      <w:bookmarkStart w:id="90" w:name="_Toc198253054"/>
+      <w:bookmarkStart w:id="91" w:name="_Toc198255380"/>
+      <w:bookmarkStart w:id="92" w:name="_Toc198518434"/>
+      <w:bookmarkStart w:id="93" w:name="_Toc220432159"/>
       <w:r>
         <w:lastRenderedPageBreak/>
         <w:t>Resume</w:t>
       </w:r>
-      <w:bookmarkEnd w:id="89"/>
       <w:bookmarkEnd w:id="90"/>
       <w:bookmarkEnd w:id="91"/>
       <w:bookmarkEnd w:id="92"/>
+      <w:bookmarkEnd w:id="93"/>
     </w:p>
     <w:p>
       <w:r>
@@ -11516,7 +11593,7 @@
               </wp:anchor>
             </w:drawing>
           </mc:Choice>
-          <mc:Fallback xmlns:w16cex="http://schemas.microsoft.com/office/word/2018/wordml/cex" xmlns:w16="http://schemas.microsoft.com/office/word/2018/wordml" xmlns:w16sdtdh="http://schemas.microsoft.com/office/word/2020/wordml/sdtdatahash" xmlns:wpsCustomData="http://www.wps.cn/officeDocument/2013/wpsCustomData">
+          <mc:Fallback xmlns:wpsCustomData="http://www.wps.cn/officeDocument/2013/wpsCustomData" xmlns:w16sdtdh="http://schemas.microsoft.com/office/word/2020/wordml/sdtdatahash" xmlns:w16="http://schemas.microsoft.com/office/word/2018/wordml" xmlns:w16cex="http://schemas.microsoft.com/office/word/2018/wordml/cex">
             <w:pict>
               <v:rect id="Rectangle 10" o:spid="_x0000_s1026" o:spt="1" style="position:absolute;left:0pt;margin-left:-0.8pt;margin-top:6.4pt;height:3.6pt;width:542.75pt;z-index:251662336;v-text-anchor:middle;mso-width-relative:page;mso-height-relative:page;" fillcolor="#000000 [3200]" filled="t" stroked="t" coordsize="21600,21600" o:gfxdata="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">
                 <v:fill on="t" focussize="0,0"/>
@@ -14762,6 +14839,25 @@
                 <v:shape id="Shape 290" o:spid="_x0000_s1038" style="position:absolute;left:598;top:18021;width:63793;height:108;visibility:visible;mso-wrap-style:square;v-text-anchor:top" coordsize="6379210,10795" o:gfxdata="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" path="m,l6379210,10795e" filled="f" strokeweight="3pt">
                   <v:path arrowok="t" o:connecttype="custom" o:connectlocs="0,0;63793,108" o:connectangles="0,0" textboxrect="0,0,6379210,10795"/>
                 </v:shape>
+                <v:shapetype id="_x0000_t75" coordsize="21600,21600" o:spt="75" o:preferrelative="t" path="m@4@5l@4@11@9@11@9@5xe" filled="f" stroked="f">
+                  <v:stroke joinstyle="miter"/>
+                  <v:formulas>
+                    <v:f eqn="if lineDrawn pixelLineWidth 0"/>
+                    <v:f eqn="sum @0 1 0"/>
+                    <v:f eqn="sum 0 0 @1"/>
+                    <v:f eqn="prod @2 1 2"/>
+                    <v:f eqn="prod @3 21600 pixelWidth"/>
+                    <v:f eqn="prod @3 21600 pixelHeight"/>
+                    <v:f eqn="sum @0 0 1"/>
+                    <v:f eqn="prod @6 1 2"/>
+                    <v:f eqn="prod @7 21600 pixelWidth"/>
+                    <v:f eqn="sum @8 21600 0"/>
+                    <v:f eqn="prod @7 21600 pixelHeight"/>
+                    <v:f eqn="sum @10 21600 0"/>
+                  </v:formulas>
+                  <v:path o:extrusionok="f" gradientshapeok="t" o:connecttype="rect"/>
+                  <o:lock v:ext="edit" aspectratio="t"/>
+                </v:shapetype>
                 <v:shape id="Picture 292" o:spid="_x0000_s1039" type="#_x0000_t75" style="position:absolute;left:48475;width:16351;height:19323;visibility:visible;mso-wrap-style:square" o:gfxdata="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">
                   <v:imagedata r:id="rId40" o:title=""/>
                 </v:shape>
@@ -21228,7 +21324,7 @@
 </file>
 
 <file path=customXml/itemProps2.xml><?xml version="1.0" encoding="utf-8"?>
-<ds:datastoreItem xmlns:ds="http://schemas.openxmlformats.org/officeDocument/2006/customXml" ds:itemID="{14EA23B6-689A-4D25-A42F-1935773543D1}">
+<ds:datastoreItem xmlns:ds="http://schemas.openxmlformats.org/officeDocument/2006/customXml" ds:itemID="{C0014709-BB49-4B02-B208-E15821DE16CD}">
   <ds:schemaRefs>
     <ds:schemaRef ds:uri="http://schemas.openxmlformats.org/officeDocument/2006/bibliography"/>
   </ds:schemaRefs>

</xml_diff>